<commit_message>
Fase 2: evidencias de funcionamiento (EVI-01) y guías 2.4 y 2.6 con anexo de capturas
</commit_message>
<xml_diff>
--- a/Fase 2/Evidencias Grupales/2.4_GuiaEstudiante Fase 2 DesarrolloProyecto APT (Español).docx
+++ b/Fase 2/Evidencias Grupales/2.4_GuiaEstudiante Fase 2 DesarrolloProyecto APT (Español).docx
@@ -863,7 +863,7 @@
                 <w:i w:val="0"/>
                 <w:sz w:val="20"/>
               </w:rPr>
-              <w:t>• Documentos de análisis y diseño: ERS-01, CU-01 y MER-01 (54 tablas).</w:t>
+              <w:t>• Documentos de análisis y diseño: ERS-01 (con matriz de trazabilidad), CU-01, MER-01 v2.0 (54 tablas, diccionario y modelo de clases), SEC-01 (diagramas de secuencia) y ARQ-01 (componentes, despliegue, estados y actividad).</w:t>
             </w:r>
           </w:p>
           <w:p>
@@ -878,7 +878,22 @@
                 <w:i w:val="0"/>
                 <w:sz w:val="20"/>
               </w:rPr>
-              <w:t>• Incremento funcional: guía de recorrido del proceso completo con usuarios por rol, verificada sobre el sistema desplegado; las capturas de cada etapa se incorporan en el informe final.</w:t>
+              <w:t>• Documentos de inicio y metodología: Acta de Constitución, Documento de Épicas e Historias de Usuario, planillas de product backlog, sprint backlog y burndown, y MET-01 (aplicación de Scrum en el proyecto).</w:t>
+            </w:r>
+          </w:p>
+          <w:p>
+            <w:pPr>
+              <w:spacing w:after="60"/>
+              <w:ind w:left="160"/>
+              <w:jc w:val="left"/>
+            </w:pPr>
+            <w:r>
+              <w:rPr>
+                <w:rFonts w:ascii="Calibri" w:hAnsi="Calibri"/>
+                <w:i w:val="0"/>
+                <w:sz w:val="20"/>
+              </w:rPr>
+              <w:t>• Recorrido del proceso completo verificado sobre el sistema desplegado y documentado en EVI-01 (12 etapas con capturas de la web, la aplicación de escritorio y los correos); las capturas se incluyen en el Anexo de este informe.</w:t>
             </w:r>
           </w:p>
           <w:p>
@@ -3147,7 +3162,7 @@
                 <w:i w:val="0"/>
                 <w:sz w:val="16"/>
               </w:rPr>
-              <w:t>Actividad nueva, producto de la reasignación.</w:t>
+              <w:t>Capturas del flujo completo realizadas (EVI-01). Pendientes: backlog, burndown y manual de usuario.</w:t>
             </w:r>
           </w:p>
         </w:tc>
@@ -3174,7 +3189,7 @@
                 <w:i w:val="0"/>
                 <w:sz w:val="16"/>
               </w:rPr>
-              <w:t>No iniciado</w:t>
+              <w:t>En curso</w:t>
             </w:r>
           </w:p>
         </w:tc>
@@ -4402,6 +4417,744 @@
           <w:lang w:val="es-ES"/>
         </w:rPr>
       </w:pPr>
+    </w:p>
+    <w:p>
+      <w:r>
+        <w:br w:type="page"/>
+      </w:r>
+    </w:p>
+    <w:p>
+      <w:pPr>
+        <w:spacing w:before="0" w:after="120"/>
+      </w:pPr>
+      <w:r>
+        <w:rPr>
+          <w:rFonts w:ascii="Calibri" w:hAnsi="Calibri"/>
+          <w:b/>
+          <w:i w:val="0"/>
+          <w:color w:val="1F3864"/>
+          <w:sz w:val="28"/>
+        </w:rPr>
+        <w:t>Anexo. Evidencias del sistema desplegado</w:t>
+      </w:r>
+    </w:p>
+    <w:p>
+      <w:pPr>
+        <w:spacing w:before="0" w:after="160"/>
+      </w:pPr>
+      <w:r>
+        <w:rPr>
+          <w:rFonts w:ascii="Calibri" w:hAnsi="Calibri"/>
+          <w:b w:val="0"/>
+          <w:i w:val="0"/>
+          <w:sz w:val="20"/>
+        </w:rPr>
+        <w:t>Capturas tomadas el 8 y 9 de octubre de 2026 sobre el sistema publicado en https://sitrafo.onrender.com (web del cliente) y la aplicación de escritorio SITRAFO.exe conectada a su API. Se muestra una captura por etapa del flujo; el detalle completo está en el documento EVI-01 del repositorio.</w:t>
+      </w:r>
+    </w:p>
+    <w:p>
+      <w:pPr>
+        <w:keepNext/>
+        <w:spacing w:before="160" w:after="80"/>
+      </w:pPr>
+      <w:r>
+        <w:rPr>
+          <w:rFonts w:ascii="Calibri" w:hAnsi="Calibri"/>
+          <w:b/>
+          <w:i w:val="0"/>
+          <w:color w:val="1F3864"/>
+          <w:sz w:val="22"/>
+        </w:rPr>
+        <w:t>1. Ingreso del cliente y solicitud de presupuesto (web)</w:t>
+      </w:r>
+    </w:p>
+    <w:p>
+      <w:pPr>
+        <w:keepNext/>
+        <w:jc w:val="center"/>
+      </w:pPr>
+      <w:r>
+        <w:drawing>
+          <wp:inline xmlns:a="http://schemas.openxmlformats.org/drawingml/2006/main" xmlns:pic="http://schemas.openxmlformats.org/drawingml/2006/picture">
+            <wp:extent cx="5400000" cy="2803032"/>
+            <wp:docPr id="50" name="Picture 50"/>
+            <wp:cNvGraphicFramePr>
+              <a:graphicFrameLocks noChangeAspect="1"/>
+            </wp:cNvGraphicFramePr>
+            <a:graphic>
+              <a:graphicData uri="http://schemas.openxmlformats.org/drawingml/2006/picture">
+                <pic:pic>
+                  <pic:nvPicPr>
+                    <pic:cNvPr id="0" name="e01b.png"/>
+                    <pic:cNvPicPr/>
+                  </pic:nvPicPr>
+                  <pic:blipFill>
+                    <a:blip r:embed="rId13"/>
+                    <a:stretch>
+                      <a:fillRect/>
+                    </a:stretch>
+                  </pic:blipFill>
+                  <pic:spPr>
+                    <a:xfrm>
+                      <a:off x="0" y="0"/>
+                      <a:ext cx="5400000" cy="2803032"/>
+                    </a:xfrm>
+                    <a:prstGeom prst="rect"/>
+                  </pic:spPr>
+                </pic:pic>
+              </a:graphicData>
+            </a:graphic>
+          </wp:inline>
+        </w:drawing>
+      </w:r>
+    </w:p>
+    <w:p>
+      <w:pPr>
+        <w:spacing w:before="0" w:after="160"/>
+        <w:jc w:val="center"/>
+      </w:pPr>
+      <w:r>
+        <w:rPr>
+          <w:rFonts w:ascii="Calibri" w:hAnsi="Calibri"/>
+          <w:b w:val="0"/>
+          <w:i/>
+          <w:color w:val="595959"/>
+          <w:sz w:val="18"/>
+        </w:rPr>
+        <w:t>Figura 1. Solicitud de presupuesto con la especificación técnica del modelo.</w:t>
+      </w:r>
+    </w:p>
+    <w:p>
+      <w:pPr>
+        <w:keepNext/>
+        <w:spacing w:before="160" w:after="80"/>
+      </w:pPr>
+      <w:r>
+        <w:rPr>
+          <w:rFonts w:ascii="Calibri" w:hAnsi="Calibri"/>
+          <w:b/>
+          <w:i w:val="0"/>
+          <w:color w:val="1F3864"/>
+          <w:sz w:val="22"/>
+        </w:rPr>
+        <w:t>3. Aprobación del descuento por otro usuario (RN-05)</w:t>
+      </w:r>
+    </w:p>
+    <w:p>
+      <w:pPr>
+        <w:keepNext/>
+        <w:jc w:val="center"/>
+      </w:pPr>
+      <w:r>
+        <w:drawing>
+          <wp:inline xmlns:a="http://schemas.openxmlformats.org/drawingml/2006/main" xmlns:pic="http://schemas.openxmlformats.org/drawingml/2006/picture">
+            <wp:extent cx="5400000" cy="2912676"/>
+            <wp:docPr id="51" name="Picture 51"/>
+            <wp:cNvGraphicFramePr>
+              <a:graphicFrameLocks noChangeAspect="1"/>
+            </wp:cNvGraphicFramePr>
+            <a:graphic>
+              <a:graphicData uri="http://schemas.openxmlformats.org/drawingml/2006/picture">
+                <pic:pic>
+                  <pic:nvPicPr>
+                    <pic:cNvPr id="0" name="e03b.png"/>
+                    <pic:cNvPicPr/>
+                  </pic:nvPicPr>
+                  <pic:blipFill>
+                    <a:blip r:embed="rId14"/>
+                    <a:stretch>
+                      <a:fillRect/>
+                    </a:stretch>
+                  </pic:blipFill>
+                  <pic:spPr>
+                    <a:xfrm>
+                      <a:off x="0" y="0"/>
+                      <a:ext cx="5400000" cy="2912676"/>
+                    </a:xfrm>
+                    <a:prstGeom prst="rect"/>
+                  </pic:spPr>
+                </pic:pic>
+              </a:graphicData>
+            </a:graphic>
+          </wp:inline>
+        </w:drawing>
+      </w:r>
+    </w:p>
+    <w:p>
+      <w:pPr>
+        <w:spacing w:before="0" w:after="160"/>
+        <w:jc w:val="center"/>
+      </w:pPr>
+      <w:r>
+        <w:rPr>
+          <w:rFonts w:ascii="Calibri" w:hAnsi="Calibri"/>
+          <w:b w:val="0"/>
+          <w:i/>
+          <w:color w:val="595959"/>
+          <w:sz w:val="18"/>
+        </w:rPr>
+        <w:t>Figura 2. Otro ejecutivo aprueba y emite (comercial2).</w:t>
+      </w:r>
+    </w:p>
+    <w:p>
+      <w:pPr>
+        <w:keepNext/>
+        <w:spacing w:before="160" w:after="80"/>
+      </w:pPr>
+      <w:r>
+        <w:rPr>
+          <w:rFonts w:ascii="Calibri" w:hAnsi="Calibri"/>
+          <w:b/>
+          <w:i w:val="0"/>
+          <w:color w:val="1F3864"/>
+          <w:sz w:val="22"/>
+        </w:rPr>
+        <w:t>5. Aceptación del cliente y orden de compra automática (RN-06)</w:t>
+      </w:r>
+    </w:p>
+    <w:p>
+      <w:pPr>
+        <w:keepNext/>
+        <w:jc w:val="center"/>
+      </w:pPr>
+      <w:r>
+        <w:drawing>
+          <wp:inline xmlns:a="http://schemas.openxmlformats.org/drawingml/2006/main" xmlns:pic="http://schemas.openxmlformats.org/drawingml/2006/picture">
+            <wp:extent cx="5400000" cy="2814563"/>
+            <wp:docPr id="52" name="Picture 52"/>
+            <wp:cNvGraphicFramePr>
+              <a:graphicFrameLocks noChangeAspect="1"/>
+            </wp:cNvGraphicFramePr>
+            <a:graphic>
+              <a:graphicData uri="http://schemas.openxmlformats.org/drawingml/2006/picture">
+                <pic:pic>
+                  <pic:nvPicPr>
+                    <pic:cNvPr id="0" name="e05a.png"/>
+                    <pic:cNvPicPr/>
+                  </pic:nvPicPr>
+                  <pic:blipFill>
+                    <a:blip r:embed="rId15"/>
+                    <a:stretch>
+                      <a:fillRect/>
+                    </a:stretch>
+                  </pic:blipFill>
+                  <pic:spPr>
+                    <a:xfrm>
+                      <a:off x="0" y="0"/>
+                      <a:ext cx="5400000" cy="2814563"/>
+                    </a:xfrm>
+                    <a:prstGeom prst="rect"/>
+                  </pic:spPr>
+                </pic:pic>
+              </a:graphicData>
+            </a:graphic>
+          </wp:inline>
+        </w:drawing>
+      </w:r>
+    </w:p>
+    <w:p>
+      <w:pPr>
+        <w:spacing w:before="0" w:after="160"/>
+        <w:jc w:val="center"/>
+      </w:pPr>
+      <w:r>
+        <w:rPr>
+          <w:rFonts w:ascii="Calibri" w:hAnsi="Calibri"/>
+          <w:b w:val="0"/>
+          <w:i/>
+          <w:color w:val="595959"/>
+          <w:sz w:val="18"/>
+        </w:rPr>
+        <w:t>Figura 3. Confirmación de la aceptación en el portal.</w:t>
+      </w:r>
+    </w:p>
+    <w:p>
+      <w:pPr>
+        <w:keepNext/>
+        <w:spacing w:before="160" w:after="80"/>
+      </w:pPr>
+      <w:r>
+        <w:rPr>
+          <w:rFonts w:ascii="Calibri" w:hAnsi="Calibri"/>
+          <w:b/>
+          <w:i w:val="0"/>
+          <w:color w:val="1F3864"/>
+          <w:sz w:val="22"/>
+        </w:rPr>
+        <w:t>6. Pago del anticipo con PayPal sandbox (RN-15)</w:t>
+      </w:r>
+    </w:p>
+    <w:p>
+      <w:pPr>
+        <w:keepNext/>
+        <w:jc w:val="center"/>
+      </w:pPr>
+      <w:r>
+        <w:drawing>
+          <wp:inline xmlns:a="http://schemas.openxmlformats.org/drawingml/2006/main" xmlns:pic="http://schemas.openxmlformats.org/drawingml/2006/picture">
+            <wp:extent cx="5400000" cy="2804607"/>
+            <wp:docPr id="53" name="Picture 53"/>
+            <wp:cNvGraphicFramePr>
+              <a:graphicFrameLocks noChangeAspect="1"/>
+            </wp:cNvGraphicFramePr>
+            <a:graphic>
+              <a:graphicData uri="http://schemas.openxmlformats.org/drawingml/2006/picture">
+                <pic:pic>
+                  <pic:nvPicPr>
+                    <pic:cNvPr id="0" name="e06b.png"/>
+                    <pic:cNvPicPr/>
+                  </pic:nvPicPr>
+                  <pic:blipFill>
+                    <a:blip r:embed="rId16"/>
+                    <a:stretch>
+                      <a:fillRect/>
+                    </a:stretch>
+                  </pic:blipFill>
+                  <pic:spPr>
+                    <a:xfrm>
+                      <a:off x="0" y="0"/>
+                      <a:ext cx="5400000" cy="2804607"/>
+                    </a:xfrm>
+                    <a:prstGeom prst="rect"/>
+                  </pic:spPr>
+                </pic:pic>
+              </a:graphicData>
+            </a:graphic>
+          </wp:inline>
+        </w:drawing>
+      </w:r>
+    </w:p>
+    <w:p>
+      <w:pPr>
+        <w:spacing w:before="0" w:after="160"/>
+        <w:jc w:val="center"/>
+      </w:pPr>
+      <w:r>
+        <w:rPr>
+          <w:rFonts w:ascii="Calibri" w:hAnsi="Calibri"/>
+          <w:b w:val="0"/>
+          <w:i/>
+          <w:color w:val="595959"/>
+          <w:sz w:val="18"/>
+        </w:rPr>
+        <w:t>Figura 4. Regreso desde PayPal con el pago registrado y su referencia.</w:t>
+      </w:r>
+    </w:p>
+    <w:p>
+      <w:pPr>
+        <w:keepNext/>
+        <w:spacing w:before="160" w:after="80"/>
+      </w:pPr>
+      <w:r>
+        <w:rPr>
+          <w:rFonts w:ascii="Calibri" w:hAnsi="Calibri"/>
+          <w:b/>
+          <w:i w:val="0"/>
+          <w:color w:val="1F3864"/>
+          <w:sz w:val="22"/>
+        </w:rPr>
+        <w:t>7. Orden de trabajo con tareas y responsables (producción)</w:t>
+      </w:r>
+    </w:p>
+    <w:p>
+      <w:pPr>
+        <w:keepNext/>
+        <w:jc w:val="center"/>
+      </w:pPr>
+      <w:r>
+        <w:drawing>
+          <wp:inline xmlns:a="http://schemas.openxmlformats.org/drawingml/2006/main" xmlns:pic="http://schemas.openxmlformats.org/drawingml/2006/picture">
+            <wp:extent cx="5400000" cy="2911378"/>
+            <wp:docPr id="54" name="Picture 54"/>
+            <wp:cNvGraphicFramePr>
+              <a:graphicFrameLocks noChangeAspect="1"/>
+            </wp:cNvGraphicFramePr>
+            <a:graphic>
+              <a:graphicData uri="http://schemas.openxmlformats.org/drawingml/2006/picture">
+                <pic:pic>
+                  <pic:nvPicPr>
+                    <pic:cNvPr id="0" name="e07.png"/>
+                    <pic:cNvPicPr/>
+                  </pic:nvPicPr>
+                  <pic:blipFill>
+                    <a:blip r:embed="rId17"/>
+                    <a:stretch>
+                      <a:fillRect/>
+                    </a:stretch>
+                  </pic:blipFill>
+                  <pic:spPr>
+                    <a:xfrm>
+                      <a:off x="0" y="0"/>
+                      <a:ext cx="5400000" cy="2911378"/>
+                    </a:xfrm>
+                    <a:prstGeom prst="rect"/>
+                  </pic:spPr>
+                </pic:pic>
+              </a:graphicData>
+            </a:graphic>
+          </wp:inline>
+        </w:drawing>
+      </w:r>
+    </w:p>
+    <w:p>
+      <w:pPr>
+        <w:spacing w:before="0" w:after="160"/>
+        <w:jc w:val="center"/>
+      </w:pPr>
+      <w:r>
+        <w:rPr>
+          <w:rFonts w:ascii="Calibri" w:hAnsi="Calibri"/>
+          <w:b w:val="0"/>
+          <w:i/>
+          <w:color w:val="595959"/>
+          <w:sz w:val="18"/>
+        </w:rPr>
+        <w:t>Figura 5. OT-2026-0005 en ejecución con sus tareas asignadas.</w:t>
+      </w:r>
+    </w:p>
+    <w:p>
+      <w:pPr>
+        <w:keepNext/>
+        <w:spacing w:before="160" w:after="80"/>
+      </w:pPr>
+      <w:r>
+        <w:rPr>
+          <w:rFonts w:ascii="Calibri" w:hAnsi="Calibri"/>
+          <w:b/>
+          <w:i w:val="0"/>
+          <w:color w:val="1F3864"/>
+          <w:sz w:val="22"/>
+        </w:rPr>
+        <w:t>8. Registro en taller y rechazo por stock insuficiente (RN-09)</w:t>
+      </w:r>
+    </w:p>
+    <w:p>
+      <w:pPr>
+        <w:keepNext/>
+        <w:jc w:val="center"/>
+      </w:pPr>
+      <w:r>
+        <w:drawing>
+          <wp:inline xmlns:a="http://schemas.openxmlformats.org/drawingml/2006/main" xmlns:pic="http://schemas.openxmlformats.org/drawingml/2006/picture">
+            <wp:extent cx="5400000" cy="2908342"/>
+            <wp:docPr id="55" name="Picture 55"/>
+            <wp:cNvGraphicFramePr>
+              <a:graphicFrameLocks noChangeAspect="1"/>
+            </wp:cNvGraphicFramePr>
+            <a:graphic>
+              <a:graphicData uri="http://schemas.openxmlformats.org/drawingml/2006/picture">
+                <pic:pic>
+                  <pic:nvPicPr>
+                    <pic:cNvPr id="0" name="e08b.png"/>
+                    <pic:cNvPicPr/>
+                  </pic:nvPicPr>
+                  <pic:blipFill>
+                    <a:blip r:embed="rId18"/>
+                    <a:stretch>
+                      <a:fillRect/>
+                    </a:stretch>
+                  </pic:blipFill>
+                  <pic:spPr>
+                    <a:xfrm>
+                      <a:off x="0" y="0"/>
+                      <a:ext cx="5400000" cy="2908342"/>
+                    </a:xfrm>
+                    <a:prstGeom prst="rect"/>
+                  </pic:spPr>
+                </pic:pic>
+              </a:graphicData>
+            </a:graphic>
+          </wp:inline>
+        </w:drawing>
+      </w:r>
+    </w:p>
+    <w:p>
+      <w:pPr>
+        <w:spacing w:before="0" w:after="160"/>
+        <w:jc w:val="center"/>
+      </w:pPr>
+      <w:r>
+        <w:rPr>
+          <w:rFonts w:ascii="Calibri" w:hAnsi="Calibri"/>
+          <w:b w:val="0"/>
+          <w:i/>
+          <w:color w:val="595959"/>
+          <w:sz w:val="18"/>
+        </w:rPr>
+        <w:t>Figura 6. Rechazo del consumo por stock insuficiente.</w:t>
+      </w:r>
+    </w:p>
+    <w:p>
+      <w:pPr>
+        <w:keepNext/>
+        <w:spacing w:before="160" w:after="80"/>
+      </w:pPr>
+      <w:r>
+        <w:rPr>
+          <w:rFonts w:ascii="Calibri" w:hAnsi="Calibri"/>
+          <w:b/>
+          <w:i w:val="0"/>
+          <w:color w:val="1F3864"/>
+          <w:sz w:val="22"/>
+        </w:rPr>
+        <w:t>9. Ensayo fuera de rango y no conformidad (RN-12)</w:t>
+      </w:r>
+    </w:p>
+    <w:p>
+      <w:pPr>
+        <w:keepNext/>
+        <w:jc w:val="center"/>
+      </w:pPr>
+      <w:r>
+        <w:drawing>
+          <wp:inline xmlns:a="http://schemas.openxmlformats.org/drawingml/2006/main" xmlns:pic="http://schemas.openxmlformats.org/drawingml/2006/picture">
+            <wp:extent cx="5400000" cy="2910078"/>
+            <wp:docPr id="56" name="Picture 56"/>
+            <wp:cNvGraphicFramePr>
+              <a:graphicFrameLocks noChangeAspect="1"/>
+            </wp:cNvGraphicFramePr>
+            <a:graphic>
+              <a:graphicData uri="http://schemas.openxmlformats.org/drawingml/2006/picture">
+                <pic:pic>
+                  <pic:nvPicPr>
+                    <pic:cNvPr id="0" name="e09a.png"/>
+                    <pic:cNvPicPr/>
+                  </pic:nvPicPr>
+                  <pic:blipFill>
+                    <a:blip r:embed="rId19"/>
+                    <a:stretch>
+                      <a:fillRect/>
+                    </a:stretch>
+                  </pic:blipFill>
+                  <pic:spPr>
+                    <a:xfrm>
+                      <a:off x="0" y="0"/>
+                      <a:ext cx="5400000" cy="2910078"/>
+                    </a:xfrm>
+                    <a:prstGeom prst="rect"/>
+                  </pic:spPr>
+                </pic:pic>
+              </a:graphicData>
+            </a:graphic>
+          </wp:inline>
+        </w:drawing>
+      </w:r>
+    </w:p>
+    <w:p>
+      <w:pPr>
+        <w:spacing w:before="0" w:after="160"/>
+        <w:jc w:val="center"/>
+      </w:pPr>
+      <w:r>
+        <w:rPr>
+          <w:rFonts w:ascii="Calibri" w:hAnsi="Calibri"/>
+          <w:b w:val="0"/>
+          <w:i/>
+          <w:color w:val="595959"/>
+          <w:sz w:val="18"/>
+        </w:rPr>
+        <w:t>Figura 7. Ensayos evaluados contra el rango del protocolo.</w:t>
+      </w:r>
+    </w:p>
+    <w:p>
+      <w:pPr>
+        <w:keepNext/>
+        <w:spacing w:before="160" w:after="80"/>
+      </w:pPr>
+      <w:r>
+        <w:rPr>
+          <w:rFonts w:ascii="Calibri" w:hAnsi="Calibri"/>
+          <w:b/>
+          <w:i w:val="0"/>
+          <w:color w:val="1F3864"/>
+          <w:sz w:val="22"/>
+        </w:rPr>
+        <w:t>10. Cierre de la OT y cobro del saldo (RN-14)</w:t>
+      </w:r>
+    </w:p>
+    <w:p>
+      <w:pPr>
+        <w:keepNext/>
+        <w:jc w:val="center"/>
+      </w:pPr>
+      <w:r>
+        <w:drawing>
+          <wp:inline xmlns:a="http://schemas.openxmlformats.org/drawingml/2006/main" xmlns:pic="http://schemas.openxmlformats.org/drawingml/2006/picture">
+            <wp:extent cx="5400000" cy="2904225"/>
+            <wp:docPr id="57" name="Picture 57"/>
+            <wp:cNvGraphicFramePr>
+              <a:graphicFrameLocks noChangeAspect="1"/>
+            </wp:cNvGraphicFramePr>
+            <a:graphic>
+              <a:graphicData uri="http://schemas.openxmlformats.org/drawingml/2006/picture">
+                <pic:pic>
+                  <pic:nvPicPr>
+                    <pic:cNvPr id="0" name="e10a.png"/>
+                    <pic:cNvPicPr/>
+                  </pic:nvPicPr>
+                  <pic:blipFill>
+                    <a:blip r:embed="rId20"/>
+                    <a:stretch>
+                      <a:fillRect/>
+                    </a:stretch>
+                  </pic:blipFill>
+                  <pic:spPr>
+                    <a:xfrm>
+                      <a:off x="0" y="0"/>
+                      <a:ext cx="5400000" cy="2904225"/>
+                    </a:xfrm>
+                    <a:prstGeom prst="rect"/>
+                  </pic:spPr>
+                </pic:pic>
+              </a:graphicData>
+            </a:graphic>
+          </wp:inline>
+        </w:drawing>
+      </w:r>
+    </w:p>
+    <w:p>
+      <w:pPr>
+        <w:spacing w:before="0" w:after="160"/>
+        <w:jc w:val="center"/>
+      </w:pPr>
+      <w:r>
+        <w:rPr>
+          <w:rFonts w:ascii="Calibri" w:hAnsi="Calibri"/>
+          <w:b w:val="0"/>
+          <w:i/>
+          <w:color w:val="595959"/>
+          <w:sz w:val="18"/>
+        </w:rPr>
+        <w:t>Figura 8. Cierre de la orden de trabajo con costo real y desviación.</w:t>
+      </w:r>
+    </w:p>
+    <w:p>
+      <w:pPr>
+        <w:keepNext/>
+        <w:spacing w:before="160" w:after="80"/>
+      </w:pPr>
+      <w:r>
+        <w:rPr>
+          <w:rFonts w:ascii="Calibri" w:hAnsi="Calibri"/>
+          <w:b/>
+          <w:i w:val="0"/>
+          <w:color w:val="1F3864"/>
+          <w:sz w:val="22"/>
+        </w:rPr>
+        <w:t>11. Entrega, kardex y auditoría</w:t>
+      </w:r>
+    </w:p>
+    <w:p>
+      <w:pPr>
+        <w:keepNext/>
+        <w:jc w:val="center"/>
+      </w:pPr>
+      <w:r>
+        <w:drawing>
+          <wp:inline xmlns:a="http://schemas.openxmlformats.org/drawingml/2006/main" xmlns:pic="http://schemas.openxmlformats.org/drawingml/2006/picture">
+            <wp:extent cx="5400000" cy="2921358"/>
+            <wp:docPr id="58" name="Picture 58"/>
+            <wp:cNvGraphicFramePr>
+              <a:graphicFrameLocks noChangeAspect="1"/>
+            </wp:cNvGraphicFramePr>
+            <a:graphic>
+              <a:graphicData uri="http://schemas.openxmlformats.org/drawingml/2006/picture">
+                <pic:pic>
+                  <pic:nvPicPr>
+                    <pic:cNvPr id="0" name="e11a.png"/>
+                    <pic:cNvPicPr/>
+                  </pic:nvPicPr>
+                  <pic:blipFill>
+                    <a:blip r:embed="rId21"/>
+                    <a:stretch>
+                      <a:fillRect/>
+                    </a:stretch>
+                  </pic:blipFill>
+                  <pic:spPr>
+                    <a:xfrm>
+                      <a:off x="0" y="0"/>
+                      <a:ext cx="5400000" cy="2921358"/>
+                    </a:xfrm>
+                    <a:prstGeom prst="rect"/>
+                  </pic:spPr>
+                </pic:pic>
+              </a:graphicData>
+            </a:graphic>
+          </wp:inline>
+        </w:drawing>
+      </w:r>
+    </w:p>
+    <w:p>
+      <w:pPr>
+        <w:spacing w:before="0" w:after="160"/>
+        <w:jc w:val="center"/>
+      </w:pPr>
+      <w:r>
+        <w:rPr>
+          <w:rFonts w:ascii="Calibri" w:hAnsi="Calibri"/>
+          <w:b w:val="0"/>
+          <w:i/>
+          <w:color w:val="595959"/>
+          <w:sz w:val="18"/>
+        </w:rPr>
+        <w:t>Figura 9. OC-2026-0007 entregada con anticipo y saldo pagados.</w:t>
+      </w:r>
+    </w:p>
+    <w:p>
+      <w:pPr>
+        <w:keepNext/>
+        <w:jc w:val="center"/>
+      </w:pPr>
+      <w:r>
+        <w:drawing>
+          <wp:inline xmlns:a="http://schemas.openxmlformats.org/drawingml/2006/main" xmlns:pic="http://schemas.openxmlformats.org/drawingml/2006/picture">
+            <wp:extent cx="5400000" cy="2904013"/>
+            <wp:docPr id="59" name="Picture 59"/>
+            <wp:cNvGraphicFramePr>
+              <a:graphicFrameLocks noChangeAspect="1"/>
+            </wp:cNvGraphicFramePr>
+            <a:graphic>
+              <a:graphicData uri="http://schemas.openxmlformats.org/drawingml/2006/picture">
+                <pic:pic>
+                  <pic:nvPicPr>
+                    <pic:cNvPr id="0" name="e11c.png"/>
+                    <pic:cNvPicPr/>
+                  </pic:nvPicPr>
+                  <pic:blipFill>
+                    <a:blip r:embed="rId22"/>
+                    <a:stretch>
+                      <a:fillRect/>
+                    </a:stretch>
+                  </pic:blipFill>
+                  <pic:spPr>
+                    <a:xfrm>
+                      <a:off x="0" y="0"/>
+                      <a:ext cx="5400000" cy="2904013"/>
+                    </a:xfrm>
+                    <a:prstGeom prst="rect"/>
+                  </pic:spPr>
+                </pic:pic>
+              </a:graphicData>
+            </a:graphic>
+          </wp:inline>
+        </w:drawing>
+      </w:r>
+    </w:p>
+    <w:p>
+      <w:pPr>
+        <w:spacing w:before="0" w:after="160"/>
+        <w:jc w:val="center"/>
+      </w:pPr>
+      <w:r>
+        <w:rPr>
+          <w:rFonts w:ascii="Calibri" w:hAnsi="Calibri"/>
+          <w:b w:val="0"/>
+          <w:i/>
+          <w:color w:val="595959"/>
+          <w:sz w:val="18"/>
+        </w:rPr>
+        <w:t>Figura 10. Bitácora de auditoría.</w:t>
+      </w:r>
     </w:p>
     <w:sectPr>
       <w:headerReference w:type="default" r:id="rId10"/>

</xml_diff>

<commit_message>
Fase 2: base de datos regenerada (MER-01 v2.1) y guias 2.4 y 2.6 actualizadas
</commit_message>
<xml_diff>
--- a/Fase 2/Evidencias Grupales/2.4_GuiaEstudiante Fase 2 DesarrolloProyecto APT (Español).docx
+++ b/Fase 2/Evidencias Grupales/2.4_GuiaEstudiante Fase 2 DesarrolloProyecto APT (Español).docx
@@ -557,7 +557,7 @@
                 <w:i w:val="0"/>
                 <w:sz w:val="20"/>
               </w:rPr>
-              <w:t>• OE4 (escritorio): aplicación PySide6 con más de 20 paneles (catálogo y recetas, clientes, cotizaciones, órdenes de compra y de trabajo, vista de taller, calidad, inventario, empleados, reportes, usuarios, matriz de permisos y auditoría), que consume exclusivamente la API.</w:t>
+              <w:t xml:space="preserve">• OE4 (escritorio): aplicación PySide6 con más de 20 paneles (catálogo y recetas, clientes, cotizaciones, órdenes de compra y de trabajo, vista de taller, calidad, inventario, empleados, reportes, usuarios, matriz de permisos y auditoría) y una bandeja de pendientes por rol al ingresar, que consume exclusivamente la API.</w:t>
             </w:r>
           </w:p>
           <w:p>
@@ -572,7 +572,7 @@
                 <w:i w:val="0"/>
                 <w:sz w:val="20"/>
               </w:rPr>
-              <w:t>• OE5 (web del cliente): catálogo con filtros técnicos, solicitud de presupuesto, aceptación de cotizaciones, seguimiento de fabricación y pago en línea.</w:t>
+              <w:t xml:space="preserve">• OE5 (web del cliente): catálogo con filtros técnicos, solicitud de presupuesto, aceptación de cotizaciones, seguimiento de fabricación, pago en línea y perfil con edición de datos y cambio de contraseña.</w:t>
             </w:r>
           </w:p>
           <w:p>
@@ -602,7 +602,7 @@
                 <w:i w:val="0"/>
                 <w:sz w:val="20"/>
               </w:rPr>
-              <w:t>• OE8 (calidad): 195 pruebas automatizadas con 91 % de cobertura, ejecutadas en cada cambio por integración continua en GitHub Actions. El sistema está desplegado en producción en Render (https://sitrafo.onrender.com).</w:t>
+              <w:t xml:space="preserve">• OE8 (calidad): 236 pruebas automatizadas con 92 % de cobertura, ejecutadas en cada cambio por integración continua en GitHub Actions. El sistema está desplegado en producción en Render (https://sitrafo.onrender.com).</w:t>
             </w:r>
           </w:p>
           <w:p>
@@ -616,7 +616,7 @@
                 <w:i w:val="0"/>
                 <w:sz w:val="20"/>
               </w:rPr>
-              <w:t>El flujo completo del negocio funciona de punta a punta: solicitud, cotización con costeo real, aprobación de descuentos, orden de compra con anticipo, orden de trabajo, registro en taller, control de calidad, cierre con cobro del saldo y entrega.</w:t>
+              <w:t xml:space="preserve">El flujo completo del negocio funciona de punta a punta: solicitud, cotización con costeo real, aprobación de descuentos, orden de compra con anticipo, orden de trabajo, registro en taller, control de calidad con aprobación del inspector que libera la orden, cierre con cobro del saldo y entrega. Además, cada rol recibe por correo los avisos de lo que debe atender y ve sus pendientes al ingresar, y los parámetros de negocio (anticipo, umbrales, vigencia, topes) se ajustan desde el escritorio sin redesplegar.</w:t>
             </w:r>
           </w:p>
         </w:tc>
@@ -863,7 +863,7 @@
                 <w:i w:val="0"/>
                 <w:sz w:val="20"/>
               </w:rPr>
-              <w:t>• Documentos de análisis y diseño: ERS-01 (con matriz de trazabilidad), CU-01, MER-01 v2.0 (54 tablas, diccionario y modelo de clases), SEC-01 (diagramas de secuencia) y ARQ-01 (componentes, despliegue, estados y actividad).</w:t>
+              <w:t xml:space="preserve">• Documentos de análisis y diseño: ERS-01 (con matriz de trazabilidad), CU-01 v2.2 (84 casos de uso en 10 paquetes, con su estado de implementación), MER-01 v2.1 (54 tablas, diccionario y modelo de clases), SEC-01 v1.1 (diagramas de secuencia), ARQ-01 v1.1 (componentes, despliegue, estados y actividad) y MOC-01 v1.1 (mockup de interfaces con las pantallas implementadas de la web y del escritorio).</w:t>
             </w:r>
           </w:p>
           <w:p>
@@ -893,7 +893,7 @@
                 <w:i w:val="0"/>
                 <w:sz w:val="20"/>
               </w:rPr>
-              <w:t>• Recorrido del proceso completo verificado sobre el sistema desplegado y documentado en EVI-01 (12 etapas con capturas de la web, la aplicación de escritorio y los correos); las capturas se incluyen en el Anexo de este informe.</w:t>
+              <w:t xml:space="preserve">• Recorrido del proceso completo verificado sobre el sistema desplegado y documentado en EVI-01 v1.3 (13 evidencias con capturas de la web, la aplicación de escritorio y los correos, incluida la aprobación de calidad, la bandeja de pendientes y los avisos entre roles); las capturas principales se incluyen en el Anexo de este informe.</w:t>
             </w:r>
           </w:p>
           <w:p>
@@ -908,6 +908,21 @@
                 <w:i w:val="0"/>
                 <w:sz w:val="20"/>
               </w:rPr>
+              <w:t xml:space="preserve">• Evidencia de base de datos: esquema DDL, datos de demostración con dos pedidos recorridos por el sistema y diccionario de datos, verificados restaurándolos en una base vacía.</w:t>
+            </w:r>
+          </w:p>
+          <w:p>
+            <w:pPr>
+              <w:spacing w:after="60"/>
+              <w:ind w:left="160"/>
+              <w:jc w:val="left"/>
+            </w:pPr>
+            <w:r>
+              <w:rPr>
+                <w:rFonts w:ascii="Calibri" w:hAnsi="Calibri"/>
+                <w:i w:val="0"/>
+                <w:sz w:val="20"/>
+              </w:rPr>
               <w:t>• Documentación técnica del repositorio: README con arquitectura, reglas de negocio implementadas, matriz de roles e instrucciones de ejecución, y documento de alcance diferido.</w:t>
             </w:r>
           </w:p>
@@ -984,6 +999,21 @@
                 <w:sz w:val="20"/>
               </w:rPr>
               <w:t>• Revisión automática en cada cambio (CI) y pruebas que simulan los servicios externos para no depender de la red.</w:t>
+            </w:r>
+          </w:p>
+          <w:p>
+            <w:pPr>
+              <w:spacing w:after="60"/>
+              <w:ind w:left="160"/>
+              <w:jc w:val="left"/>
+            </w:pPr>
+            <w:r>
+              <w:rPr>
+                <w:rFonts w:ascii="Calibri" w:hAnsi="Calibri"/>
+                <w:i w:val="0"/>
+                <w:sz w:val="20"/>
+              </w:rPr>
+              <w:t xml:space="preserve">• Coordinación entre roles calculada desde los permisos: la bandeja de pendientes y los avisos por correo muestran a cada usuario solo lo que su rol puede atender.</w:t>
             </w:r>
           </w:p>
         </w:tc>
@@ -2586,7 +2616,7 @@
                 <w:i w:val="0"/>
                 <w:sz w:val="16"/>
               </w:rPr>
-              <w:t>Se amplió con vista de taller, reportes, matriz de permisos y auditoría.</w:t>
+              <w:t xml:space="preserve">Se amplió con vista de taller, reportes, matriz de permisos, auditoría, bandeja de pendientes y edición de parámetros.</w:t>
             </w:r>
           </w:p>
         </w:tc>
@@ -3162,7 +3192,7 @@
                 <w:i w:val="0"/>
                 <w:sz w:val="16"/>
               </w:rPr>
-              <w:t>Capturas del flujo completo realizadas (EVI-01). Pendientes: backlog, burndown y manual de usuario.</w:t>
+              <w:t xml:space="preserve">El recorrido con capturas del flujo (EVI-01) ya está realizado. Pendientes a su cargo: product backlog, sprint backlog, burndown y manual de usuario, con plazo el 14-10-2026.</w:t>
             </w:r>
           </w:p>
         </w:tc>
@@ -3372,7 +3402,7 @@
                 <w:i w:val="0"/>
                 <w:sz w:val="16"/>
               </w:rPr>
-              <w:t>Requiere el sistema desplegado.</w:t>
+              <w:t xml:space="preserve">El sistema ya está desplegado y cuenta con guía paso a paso; plazo 14-10-2026.</w:t>
             </w:r>
           </w:p>
         </w:tc>
@@ -4284,7 +4314,7 @@
                 <w:i w:val="0"/>
                 <w:sz w:val="20"/>
               </w:rPr>
-              <w:t>• Se agregaron funcionalidades no planificadas que el negocio requería: cobro del saldo al terminar la fabricación, anulación de documentos con motivo, reportes exportables a Excel y PDF, y avisos del sitio con vigencia.</w:t>
+              <w:t xml:space="preserve">• Se agregaron funcionalidades no planificadas que el negocio requería: cobro del saldo al terminar la fabricación, anulación de documentos con motivo, reportes exportables a Excel y PDF, avisos del sitio con vigencia, aprobación del control de calidad que libera la orden, avisos internos por correo y bandeja de pendientes por rol, parámetros de negocio editables con validación de rango, y mantención de contactos, familias, parámetros técnicos y bodegas con desactivación en lugar de borrado.</w:t>
             </w:r>
           </w:p>
         </w:tc>
@@ -4390,7 +4420,7 @@
                 <w:i w:val="0"/>
                 <w:sz w:val="20"/>
               </w:rPr>
-              <w:t>• Documentación Scrum y evidencias (Camila Olivares) y verificación de calidad y seguridad (Milko Soto): no iniciadas porque son actividades nuevas producto de la reasignación. Estrategia: tareas con guía paso a paso, entregables concretos y commits propios en el repositorio, con revisión semanal del líder, para cerrarlas antes de la semana 12 y llegar al informe final con todas las evidencias.</w:t>
+              <w:t xml:space="preserve">• Documentación Scrum y evidencias (Camila Olivares) y verificación de calidad y seguridad (Milko Soto): actividades nuevas producto de la reasignación. Estrategia: tareas con guía paso a paso, entregables concretos y commits propios en el repositorio, con revisión del líder y plazo el 14 de octubre de 2026, para llegar al informe final con todas las evidencias.</w:t>
             </w:r>
           </w:p>
           <w:p>
@@ -4405,7 +4435,7 @@
                 <w:i w:val="0"/>
                 <w:sz w:val="20"/>
               </w:rPr>
-              <w:t>• Pruebas de interfaz con Selenium: pendientes dentro de la tarea de Milko Soto. La lógica ya está cubierta por 195 pruebas automatizadas; Selenium agrega la verificación de las pantallas.</w:t>
+              <w:t xml:space="preserve">• Pruebas de interfaz con Selenium: pendientes dentro de la tarea de Milko Soto. La lógica ya está cubierta por 236 pruebas automatizadas con 92 % de cobertura; Selenium agrega la verificación de las pantallas.</w:t>
             </w:r>
           </w:p>
         </w:tc>

</xml_diff>